<commit_message>
chore: refresh 24 APR docs (TPFDD/RFF/NAI/Roster minor updates)
LTC Sheaf 24 APR email returned the four working documents
"saved with the most current date." Actual diffs are small:

- Mission Roster: no content change (filename only)
- TPFDD: "Rest" -> "Reset" typo fix in status-code legend
- RFF/RFS: QRF task now "subordinate to the incident commander"
  (was "commander"); SECFOR screen description wording tweak
- NAI Graphics: SECFOR Patrol Ops slide annotated with approx.
  distances ~2200 m and ~2700 m from the ICP

Source files at /docs/source/ replaced in-place. Comms log
entry added. Ops Graphics page notes the new distance
annotations under SECFOR posture.

Co-Authored-By: Claude Opus 4.6 (1M context) <noreply@anthropic.com>
</commit_message>
<xml_diff>
--- a/site/docs/source/RFF-RFS-TNMAN-26.docx
+++ b/site/docs/source/RFF-RFS-TNMAN-26.docx
@@ -720,7 +720,19 @@
               <w:rPr>
                 <w:rFonts w:ascii="Times New Roman" w:hAnsi="Times New Roman" w:cs="Times New Roman"/>
               </w:rPr>
-              <w:t xml:space="preserve"> Dismounted / Foot patrol, in urbanized terrain, for a four-hour period. Mobile Phone / Handheld </w:t>
+              <w:t xml:space="preserve"> Dismounted / Foot patrol, in urbanized </w:t>
+            </w:r>
+            <w:r>
+              <w:rPr>
+                <w:rFonts w:ascii="Times New Roman" w:hAnsi="Times New Roman" w:cs="Times New Roman"/>
+              </w:rPr>
+              <w:t xml:space="preserve">or wooded </w:t>
+            </w:r>
+            <w:r>
+              <w:rPr>
+                <w:rFonts w:ascii="Times New Roman" w:hAnsi="Times New Roman" w:cs="Times New Roman"/>
+              </w:rPr>
+              <w:t xml:space="preserve">terrain, for a four-hour period. Mobile Phone / Handheld </w:t>
             </w:r>
             <w:r>
               <w:rPr>
@@ -801,25 +813,29 @@
               </w:rPr>
               <w:t xml:space="preserve"> directly </w:t>
             </w:r>
-            <w:proofErr w:type="gramStart"/>
-            <w:r>
-              <w:rPr>
-                <w:rFonts w:ascii="Times New Roman" w:hAnsi="Times New Roman" w:cs="Times New Roman"/>
-              </w:rPr>
-              <w:t>subordinate</w:t>
-            </w:r>
-            <w:proofErr w:type="gramEnd"/>
-            <w:r>
-              <w:rPr>
-                <w:rFonts w:ascii="Times New Roman" w:hAnsi="Times New Roman" w:cs="Times New Roman"/>
-              </w:rPr>
-              <w:t xml:space="preserve"> </w:t>
-            </w:r>
-            <w:r>
-              <w:rPr>
-                <w:rFonts w:ascii="Times New Roman" w:hAnsi="Times New Roman" w:cs="Times New Roman"/>
-              </w:rPr>
-              <w:t>to the commander</w:t>
+            <w:r>
+              <w:rPr>
+                <w:rFonts w:ascii="Times New Roman" w:hAnsi="Times New Roman" w:cs="Times New Roman"/>
+              </w:rPr>
+              <w:t xml:space="preserve">subordinate </w:t>
+            </w:r>
+            <w:r>
+              <w:rPr>
+                <w:rFonts w:ascii="Times New Roman" w:hAnsi="Times New Roman" w:cs="Times New Roman"/>
+              </w:rPr>
+              <w:t xml:space="preserve">to the </w:t>
+            </w:r>
+            <w:r>
+              <w:rPr>
+                <w:rFonts w:ascii="Times New Roman" w:hAnsi="Times New Roman" w:cs="Times New Roman"/>
+              </w:rPr>
+              <w:t xml:space="preserve">incident </w:t>
+            </w:r>
+            <w:r>
+              <w:rPr>
+                <w:rFonts w:ascii="Times New Roman" w:hAnsi="Times New Roman" w:cs="Times New Roman"/>
+              </w:rPr>
+              <w:t>commander</w:t>
             </w:r>
             <w:r>
               <w:rPr>
@@ -979,19 +995,11 @@
                 <w:rFonts w:ascii="Times New Roman" w:hAnsi="Times New Roman" w:cs="Times New Roman"/>
               </w:rPr>
             </w:pPr>
-            <w:proofErr w:type="gramStart"/>
-            <w:r>
-              <w:rPr>
-                <w:rFonts w:ascii="Times New Roman" w:hAnsi="Times New Roman" w:cs="Times New Roman"/>
-              </w:rPr>
-              <w:t>An LNO</w:t>
-            </w:r>
-            <w:proofErr w:type="gramEnd"/>
-            <w:r>
-              <w:rPr>
-                <w:rFonts w:ascii="Times New Roman" w:hAnsi="Times New Roman" w:cs="Times New Roman"/>
-              </w:rPr>
-              <w:t xml:space="preserve"> acts as a formal link between organizations or groups to ensure smooth communication, coordination, and collaboration toward shared objectives.</w:t>
+            <w:r>
+              <w:rPr>
+                <w:rFonts w:ascii="Times New Roman" w:hAnsi="Times New Roman" w:cs="Times New Roman"/>
+              </w:rPr>
+              <w:t>An LNO acts as a formal link between organizations or groups to ensure smooth communication, coordination, and collaboration toward shared objectives.</w:t>
             </w:r>
           </w:p>
         </w:tc>
@@ -1032,6 +1040,7 @@
               <w:rPr>
                 <w:rFonts w:ascii="Times New Roman" w:hAnsi="Times New Roman" w:cs="Times New Roman"/>
               </w:rPr>
+              <w:lastRenderedPageBreak/>
               <w:t>Liaison Officer (LNO) – 4 RGT</w:t>
             </w:r>
           </w:p>
@@ -1082,14 +1091,7 @@
               <w:rPr>
                 <w:rFonts w:ascii="Times New Roman" w:hAnsi="Times New Roman" w:cs="Times New Roman"/>
               </w:rPr>
-              <w:t xml:space="preserve"> acts as a formal link between organizations or groups to ensure smooth </w:t>
-            </w:r>
-            <w:r>
-              <w:rPr>
-                <w:rFonts w:ascii="Times New Roman" w:hAnsi="Times New Roman" w:cs="Times New Roman"/>
-              </w:rPr>
-              <w:lastRenderedPageBreak/>
-              <w:t>communication, coordination, and collaboration toward shared objectives.</w:t>
+              <w:t xml:space="preserve"> acts as a formal link between organizations or groups to ensure smooth communication, coordination, and collaboration toward shared objectives.</w:t>
             </w:r>
           </w:p>
         </w:tc>
@@ -1109,7 +1111,6 @@
               <w:rPr>
                 <w:rFonts w:ascii="Times New Roman" w:hAnsi="Times New Roman" w:cs="Times New Roman"/>
               </w:rPr>
-              <w:lastRenderedPageBreak/>
               <w:t>1</w:t>
             </w:r>
           </w:p>
@@ -1532,7 +1533,14 @@
               <w:rPr>
                 <w:rFonts w:ascii="Times New Roman" w:hAnsi="Times New Roman" w:cs="Times New Roman"/>
               </w:rPr>
-              <w:t>perators must ensure their sUAS is equipped with the necessary communication links and components for safe operation.</w:t>
+              <w:t xml:space="preserve">perators must ensure their sUAS is equipped with the necessary </w:t>
+            </w:r>
+            <w:r>
+              <w:rPr>
+                <w:rFonts w:ascii="Times New Roman" w:hAnsi="Times New Roman" w:cs="Times New Roman"/>
+              </w:rPr>
+              <w:lastRenderedPageBreak/>
+              <w:t>communication links and components for safe operation.</w:t>
             </w:r>
           </w:p>
         </w:tc>
@@ -1552,6 +1560,7 @@
               <w:rPr>
                 <w:rFonts w:ascii="Times New Roman" w:hAnsi="Times New Roman" w:cs="Times New Roman"/>
               </w:rPr>
+              <w:lastRenderedPageBreak/>
               <w:t>3</w:t>
             </w:r>
           </w:p>
@@ -1955,33 +1964,11 @@
                 <w:rFonts w:ascii="Times New Roman" w:hAnsi="Times New Roman" w:cs="Times New Roman"/>
               </w:rPr>
             </w:pPr>
-            <w:proofErr w:type="gramStart"/>
-            <w:r>
-              <w:rPr>
-                <w:rFonts w:ascii="Times New Roman" w:hAnsi="Times New Roman" w:cs="Times New Roman"/>
-              </w:rPr>
-              <w:t>HF Radio,</w:t>
-            </w:r>
-            <w:proofErr w:type="gramEnd"/>
-            <w:r>
-              <w:rPr>
-                <w:rFonts w:ascii="Times New Roman" w:hAnsi="Times New Roman" w:cs="Times New Roman"/>
-              </w:rPr>
-              <w:t xml:space="preserve"> operates in the radio frequency range of 3 to 30 </w:t>
-            </w:r>
-            <w:proofErr w:type="spellStart"/>
-            <w:r>
-              <w:rPr>
-                <w:rFonts w:ascii="Times New Roman" w:hAnsi="Times New Roman" w:cs="Times New Roman"/>
-              </w:rPr>
-              <w:t>MHz.</w:t>
-            </w:r>
-            <w:proofErr w:type="spellEnd"/>
-            <w:r>
-              <w:rPr>
-                <w:rFonts w:ascii="Times New Roman" w:hAnsi="Times New Roman" w:cs="Times New Roman"/>
-              </w:rPr>
-              <w:t xml:space="preserve"> It’s a key mode of communication for long-distance transmission, capable of reaching </w:t>
+            <w:r>
+              <w:rPr>
+                <w:rFonts w:ascii="Times New Roman" w:hAnsi="Times New Roman" w:cs="Times New Roman"/>
+              </w:rPr>
+              <w:t xml:space="preserve">HF Radio, operates in the radio frequency range of 3 to 30 MHz. It’s a key mode of communication for long-distance transmission, capable of reaching </w:t>
             </w:r>
             <w:r>
               <w:rPr>
@@ -2011,27 +1998,13 @@
               <w:rPr>
                 <w:rFonts w:ascii="Times New Roman" w:hAnsi="Times New Roman" w:cs="Times New Roman"/>
               </w:rPr>
-              <w:t xml:space="preserve"> </w:t>
-            </w:r>
-            <w:proofErr w:type="spellStart"/>
-            <w:r>
-              <w:rPr>
-                <w:rFonts w:ascii="Times New Roman" w:hAnsi="Times New Roman" w:cs="Times New Roman"/>
-              </w:rPr>
-              <w:t>is</w:t>
-            </w:r>
-            <w:r>
-              <w:rPr>
-                <w:rFonts w:ascii="Times New Roman" w:hAnsi="Times New Roman" w:cs="Times New Roman"/>
-              </w:rPr>
-              <w:t>s</w:t>
-            </w:r>
-            <w:proofErr w:type="spellEnd"/>
-            <w:r>
-              <w:rPr>
-                <w:rFonts w:ascii="Times New Roman" w:hAnsi="Times New Roman" w:cs="Times New Roman"/>
-              </w:rPr>
-              <w:t xml:space="preserve"> ab</w:t>
+              <w:t xml:space="preserve"> is</w:t>
+            </w:r>
+            <w:r>
+              <w:rPr>
+                <w:rFonts w:ascii="Times New Roman" w:hAnsi="Times New Roman" w:cs="Times New Roman"/>
+              </w:rPr>
+              <w:t>s ab</w:t>
             </w:r>
             <w:r>
               <w:rPr>
@@ -2643,7 +2616,7 @@
         <w:bCs/>
         <w:noProof/>
       </w:rPr>
-      <w:t>4/21/2026 6:39 AM</w:t>
+      <w:t>4/22/2026 6:57 PM</w:t>
     </w:r>
     <w:r>
       <w:rPr>

</xml_diff>